<commit_message>
Match the reference report's typography exactly
Read the supplied .docx rather than inferring from the PDF, and applied its
actual settings: 1in margins (pgMar 1440 twips), Times New Roman 12pt, 1.5
line spacing, 6pt space after each paragraph, 0.5in first-line indent, H1
centred 14pt bold, H2 12.5pt, H3 bold in the darker blue, and a 9pt running
header.

Known deviation: the reference sets Word's "different first page" so its title
page carries no header or footer. Chrome paints header and footer templates on
every page regardless of @page :first, so the cover shows a page number. Both
alternatives were tried and are worse: dropping the footer template restores a
clean cover but replaces the bare page number with "N of M", and moving margin
control into CSS does not stop Chrome painting the margin boxes.

Co-Authored-By: Claude Opus 5 <noreply@anthropic.com>
</commit_message>
<xml_diff>
--- a/docs/reports/build/end-semester-report-alt-diagrams.docx
+++ b/docs/reports/build/end-semester-report-alt-diagrams.docx
@@ -25,12 +25,12 @@
           <wp:inline distB="0" distL="0" distR="0" distT="0">
             <wp:extent cx="5486400" cy="2926080"/>
             <wp:effectExtent b="0" l="0" r="0" t="0"/>
-            <wp:docPr id="2" name="image-gLF7vR1LUJu7WE4Dy0aWg.png"/>
+            <wp:docPr id="2" name="image-fPPLvof0dxfpQH1tVXyWI.png"/>
             <a:graphic>
               <a:graphicData uri="http://schemas.openxmlformats.org/drawingml/2006/picture">
                 <pic:pic>
                   <pic:nvPicPr>
-                    <pic:cNvPr id="2" name="image-gLF7vR1LUJu7WE4Dy0aWg.png" descr="United States International University Africa logo"/>
+                    <pic:cNvPr id="2" name="image-fPPLvof0dxfpQH1tVXyWI.png" descr="United States International University Africa logo"/>
                     <pic:cNvPicPr/>
                   </pic:nvPicPr>
                   <pic:blipFill>
@@ -6628,12 +6628,12 @@
           <wp:inline distB="0" distL="0" distR="0" distT="0">
             <wp:extent cx="5486400" cy="12192000"/>
             <wp:effectExtent b="0" l="0" r="0" t="0"/>
-            <wp:docPr id="4" name="image-L8kQtf6a3Nxv0QPH0qQ2H.png"/>
+            <wp:docPr id="4" name="image-ucVJNTJb1kRNV-kkhDeA5.png"/>
             <a:graphic>
               <a:graphicData uri="http://schemas.openxmlformats.org/drawingml/2006/picture">
                 <pic:pic>
                   <pic:nvPicPr>
-                    <pic:cNvPr id="4" name="image-L8kQtf6a3Nxv0QPH0qQ2H.png" descr="Home dashboard of the mobile application"/>
+                    <pic:cNvPr id="4" name="image-ucVJNTJb1kRNV-kkhDeA5.png" descr="Home dashboard of the mobile application"/>
                     <pic:cNvPicPr/>
                   </pic:nvPicPr>
                   <pic:blipFill>
@@ -6667,12 +6667,12 @@
           <wp:inline distB="0" distL="0" distR="0" distT="0">
             <wp:extent cx="5486400" cy="12192000"/>
             <wp:effectExtent b="0" l="0" r="0" t="0"/>
-            <wp:docPr id="6" name="image-4_BBvohdGjAraOOShKJKI.png"/>
+            <wp:docPr id="6" name="image-i91b74BCfGxMv4GvyDgJj.png"/>
             <a:graphic>
               <a:graphicData uri="http://schemas.openxmlformats.org/drawingml/2006/picture">
                 <pic:pic>
                   <pic:nvPicPr>
-                    <pic:cNvPr id="6" name="image-4_BBvohdGjAraOOShKJKI.png" descr="Symptom selection screen"/>
+                    <pic:cNvPr id="6" name="image-i91b74BCfGxMv4GvyDgJj.png" descr="Symptom selection screen"/>
                     <pic:cNvPicPr/>
                   </pic:nvPicPr>
                   <pic:blipFill>
@@ -6706,12 +6706,12 @@
           <wp:inline distB="0" distL="0" distR="0" distT="0">
             <wp:extent cx="5486400" cy="12192000"/>
             <wp:effectExtent b="0" l="0" r="0" t="0"/>
-            <wp:docPr id="8" name="image-vzdwTIeYCx95h3mJMheVG.png"/>
+            <wp:docPr id="8" name="image-MIgZMGcpHsEuwzrQFvLOc.png"/>
             <a:graphic>
               <a:graphicData uri="http://schemas.openxmlformats.org/drawingml/2006/picture">
                 <pic:pic>
                   <pic:nvPicPr>
-                    <pic:cNvPr id="8" name="image-vzdwTIeYCx95h3mJMheVG.png" descr="Ranked results with explainability chips"/>
+                    <pic:cNvPr id="8" name="image-MIgZMGcpHsEuwzrQFvLOc.png" descr="Ranked results with explainability chips"/>
                     <pic:cNvPicPr/>
                   </pic:nvPicPr>
                   <pic:blipFill>
@@ -6745,12 +6745,12 @@
           <wp:inline distB="0" distL="0" distR="0" distT="0">
             <wp:extent cx="5486400" cy="12192000"/>
             <wp:effectExtent b="0" l="0" r="0" t="0"/>
-            <wp:docPr id="10" name="image-9qdTN6Q_Uo2BKegYsQrJr.png"/>
+            <wp:docPr id="10" name="image-jHOANsDjZSLfoH17Cd66c.png"/>
             <a:graphic>
               <a:graphicData uri="http://schemas.openxmlformats.org/drawingml/2006/picture">
                 <pic:pic>
                   <pic:nvPicPr>
-                    <pic:cNvPr id="10" name="image-9qdTN6Q_Uo2BKegYsQrJr.png" descr="Nearby providers list"/>
+                    <pic:cNvPr id="10" name="image-jHOANsDjZSLfoH17Cd66c.png" descr="Nearby providers list"/>
                     <pic:cNvPicPr/>
                   </pic:nvPicPr>
                   <pic:blipFill>
@@ -6784,12 +6784,12 @@
           <wp:inline distB="0" distL="0" distR="0" distT="0">
             <wp:extent cx="5486400" cy="12192000"/>
             <wp:effectExtent b="0" l="0" r="0" t="0"/>
-            <wp:docPr id="12" name="image-Pgv2SRyGsldS3dW6rS2MU.png"/>
+            <wp:docPr id="12" name="image-fk5xNGA6TfL8P7p-YxTnW.png"/>
             <a:graphic>
               <a:graphicData uri="http://schemas.openxmlformats.org/drawingml/2006/picture">
                 <pic:pic>
                   <pic:nvPicPr>
-                    <pic:cNvPr id="12" name="image-Pgv2SRyGsldS3dW6rS2MU.png" descr="Query history screen"/>
+                    <pic:cNvPr id="12" name="image-fk5xNGA6TfL8P7p-YxTnW.png" descr="Query history screen"/>
                     <pic:cNvPicPr/>
                   </pic:nvPicPr>
                   <pic:blipFill>

</xml_diff>